<commit_message>
Final exam schedule update
</commit_message>
<xml_diff>
--- a/calendars/F26-Stat216_Calendar.docx
+++ b/calendars/F26-Stat216_Calendar.docx
@@ -1,6 +1,6 @@
 
 <file path=word/document.xml><?xml version="1.0" encoding="utf-8"?>
-<w:document xmlns:wpc="http://schemas.microsoft.com/office/word/2010/wordprocessingCanvas" xmlns:cx="http://schemas.microsoft.com/office/drawing/2014/chartex" xmlns:cx1="http://schemas.microsoft.com/office/drawing/2015/9/8/chartex" xmlns:cx2="http://schemas.microsoft.com/office/drawing/2015/10/21/chartex" xmlns:cx3="http://schemas.microsoft.com/office/drawing/2016/5/9/chartex" xmlns:cx4="http://schemas.microsoft.com/office/drawing/2016/5/10/chartex" xmlns:cx5="http://schemas.microsoft.com/office/drawing/2016/5/11/chartex" xmlns:cx6="http://schemas.microsoft.com/office/drawing/2016/5/12/chartex" xmlns:cx7="http://schemas.microsoft.com/office/drawing/2016/5/13/chartex" xmlns:cx8="http://schemas.microsoft.com/office/drawing/2016/5/14/chartex" xmlns:mc="http://schemas.openxmlformats.org/markup-compatibility/2006" xmlns:aink="http://schemas.microsoft.com/office/drawing/2016/ink" xmlns:am3d="http://schemas.microsoft.com/office/drawing/2017/model3d" xmlns:o="urn:schemas-microsoft-com:office:office" xmlns:oel="http://schemas.microsoft.com/office/2019/extlst" xmlns:r="http://schemas.openxmlformats.org/officeDocument/2006/relationships" xmlns:m="http://schemas.openxmlformats.org/officeDocument/2006/math" xmlns:v="urn:schemas-microsoft-com:vml" xmlns:wp14="http://schemas.microsoft.com/office/word/2010/wordprocessingDrawing" xmlns:wp="http://schemas.openxmlformats.org/drawingml/2006/wordprocessingDrawing" xmlns:w10="urn:schemas-microsoft-com:office:word" xmlns:w="http://schemas.openxmlformats.org/wordprocessingml/2006/main" xmlns:w14="http://schemas.microsoft.com/office/word/2010/wordml" xmlns:w15="http://schemas.microsoft.com/office/word/2012/wordml" xmlns:w16cei="http://schemas.microsoft.com/office/word/2026/wordml/cei" xmlns:w16cex="http://schemas.microsoft.com/office/word/2018/wordml/cex" xmlns:w16cid="http://schemas.microsoft.com/office/word/2016/wordml/cid" xmlns:w16="http://schemas.microsoft.com/office/word/2018/wordml" xmlns:w16du="http://schemas.microsoft.com/office/word/2023/wordml/word16du" xmlns:w16sdtdh="http://schemas.microsoft.com/office/word/2020/wordml/sdtdatahash" xmlns:w16sdtfl="http://schemas.microsoft.com/office/word/2024/wordml/sdtformatlock" xmlns:w16se="http://schemas.microsoft.com/office/word/2015/wordml/symex" xmlns:wpg="http://schemas.microsoft.com/office/word/2010/wordprocessingGroup" xmlns:wpi="http://schemas.microsoft.com/office/word/2010/wordprocessingInk" xmlns:wne="http://schemas.microsoft.com/office/word/2006/wordml" xmlns:wps="http://schemas.microsoft.com/office/word/2010/wordprocessingShape" mc:Ignorable="w14 w15 w16se w16cid w16 w16cex w16sdtdh w16sdtfl w16du wp14">
+<w:document xmlns:wpc="http://schemas.microsoft.com/office/word/2010/wordprocessingCanvas" xmlns:cx="http://schemas.microsoft.com/office/drawing/2014/chartex" xmlns:cx1="http://schemas.microsoft.com/office/drawing/2015/9/8/chartex" xmlns:cx2="http://schemas.microsoft.com/office/drawing/2015/10/21/chartex" xmlns:cx3="http://schemas.microsoft.com/office/drawing/2016/5/9/chartex" xmlns:cx4="http://schemas.microsoft.com/office/drawing/2016/5/10/chartex" xmlns:cx5="http://schemas.microsoft.com/office/drawing/2016/5/11/chartex" xmlns:cx6="http://schemas.microsoft.com/office/drawing/2016/5/12/chartex" xmlns:cx7="http://schemas.microsoft.com/office/drawing/2016/5/13/chartex" xmlns:cx8="http://schemas.microsoft.com/office/drawing/2016/5/14/chartex" xmlns:mc="http://schemas.openxmlformats.org/markup-compatibility/2006" xmlns:aink="http://schemas.microsoft.com/office/drawing/2016/ink" xmlns:am3d="http://schemas.microsoft.com/office/drawing/2017/model3d" xmlns:o="urn:schemas-microsoft-com:office:office" xmlns:oel="http://schemas.microsoft.com/office/2019/extlst" xmlns:r="http://schemas.openxmlformats.org/officeDocument/2006/relationships" xmlns:m="http://schemas.openxmlformats.org/officeDocument/2006/math" xmlns:v="urn:schemas-microsoft-com:vml" xmlns:wp14="http://schemas.microsoft.com/office/word/2010/wordprocessingDrawing" xmlns:wp="http://schemas.openxmlformats.org/drawingml/2006/wordprocessingDrawing" xmlns:w10="urn:schemas-microsoft-com:office:word" xmlns:w="http://schemas.openxmlformats.org/wordprocessingml/2006/main" xmlns:w14="http://schemas.microsoft.com/office/word/2010/wordml" xmlns:w15="http://schemas.microsoft.com/office/word/2012/wordml" xmlns:w16cex="http://schemas.microsoft.com/office/word/2018/wordml/cex" xmlns:w16cid="http://schemas.microsoft.com/office/word/2016/wordml/cid" xmlns:w16="http://schemas.microsoft.com/office/word/2018/wordml" xmlns:w16du="http://schemas.microsoft.com/office/word/2023/wordml/word16du" xmlns:w16sdtdh="http://schemas.microsoft.com/office/word/2020/wordml/sdtdatahash" xmlns:w16sdtfl="http://schemas.microsoft.com/office/word/2024/wordml/sdtformatlock" xmlns:w16se="http://schemas.microsoft.com/office/word/2015/wordml/symex" xmlns:wpg="http://schemas.microsoft.com/office/word/2010/wordprocessingGroup" xmlns:wpi="http://schemas.microsoft.com/office/word/2010/wordprocessingInk" xmlns:wne="http://schemas.microsoft.com/office/word/2006/wordml" xmlns:wps="http://schemas.microsoft.com/office/word/2010/wordprocessingShape" mc:Ignorable="w14 w15 w16se w16cid w16 w16cex w16sdtdh w16sdtfl w16du wp14">
   <w:body>
     <w:p>
       <w:pPr>
@@ -152,20 +152,8 @@
           <w:sz w:val="24"/>
           <w:szCs w:val="24"/>
         </w:rPr>
-        <w:t xml:space="preserve"> </w:t>
+        <w:t xml:space="preserve"> Gradescope</w:t>
       </w:r>
-      <w:proofErr w:type="spellStart"/>
-      <w:r>
-        <w:rPr>
-          <w:rFonts w:ascii="Times New Roman" w:hAnsi="Times New Roman" w:cs="Times New Roman"/>
-          <w:i/>
-          <w:iCs/>
-          <w:sz w:val="24"/>
-          <w:szCs w:val="24"/>
-        </w:rPr>
-        <w:t>Gradescope</w:t>
-      </w:r>
-      <w:proofErr w:type="spellEnd"/>
     </w:p>
     <w:p>
       <w:pPr>
@@ -211,18 +199,8 @@
           <w:sz w:val="24"/>
           <w:szCs w:val="24"/>
         </w:rPr>
-        <w:t xml:space="preserve"> due at the beginning of </w:t>
+        <w:t xml:space="preserve"> due at the beginning of class</w:t>
       </w:r>
-      <w:proofErr w:type="gramStart"/>
-      <w:r>
-        <w:rPr>
-          <w:rFonts w:ascii="Times New Roman" w:eastAsia="Times New Roman" w:hAnsi="Times New Roman" w:cs="Times New Roman"/>
-          <w:sz w:val="24"/>
-          <w:szCs w:val="24"/>
-        </w:rPr>
-        <w:t>class</w:t>
-      </w:r>
-      <w:proofErr w:type="gramEnd"/>
       <w:r>
         <w:rPr>
           <w:rFonts w:ascii="Times New Roman" w:eastAsia="Times New Roman" w:hAnsi="Times New Roman" w:cs="Times New Roman"/>
@@ -1163,7 +1141,6 @@
                 <w:szCs w:val="24"/>
               </w:rPr>
             </w:pPr>
-            <w:proofErr w:type="spellStart"/>
             <w:r>
               <w:rPr>
                 <w:rFonts w:ascii="Times New Roman" w:hAnsi="Times New Roman" w:cs="Times New Roman"/>
@@ -1173,7 +1150,6 @@
               </w:rPr>
               <w:t>Data_Basics</w:t>
             </w:r>
-            <w:proofErr w:type="spellEnd"/>
           </w:p>
           <w:p>
             <w:pPr>
@@ -1736,7 +1712,6 @@
                 <w:sz w:val="24"/>
               </w:rPr>
             </w:pPr>
-            <w:proofErr w:type="spellStart"/>
             <w:r>
               <w:rPr>
                 <w:rFonts w:ascii="Times New Roman" w:eastAsia="Times New Roman" w:hAnsi="Times New Roman" w:cs="Times New Roman"/>
@@ -1745,7 +1720,6 @@
               </w:rPr>
               <w:t>One_Categorical_Variable_EDA</w:t>
             </w:r>
-            <w:proofErr w:type="spellEnd"/>
           </w:p>
           <w:p>
             <w:pPr>
@@ -1756,7 +1730,6 @@
                 <w:sz w:val="24"/>
               </w:rPr>
             </w:pPr>
-            <w:proofErr w:type="spellStart"/>
             <w:r>
               <w:rPr>
                 <w:rFonts w:ascii="Times New Roman" w:eastAsia="Times New Roman" w:hAnsi="Times New Roman" w:cs="Times New Roman"/>
@@ -1765,7 +1738,6 @@
               </w:rPr>
               <w:t>Hypothesis_Testing</w:t>
             </w:r>
-            <w:proofErr w:type="spellEnd"/>
           </w:p>
           <w:p>
             <w:pPr>
@@ -1776,7 +1748,6 @@
                 <w:sz w:val="24"/>
               </w:rPr>
             </w:pPr>
-            <w:proofErr w:type="spellStart"/>
             <w:r>
               <w:rPr>
                 <w:rFonts w:ascii="Times New Roman" w:eastAsia="Times New Roman" w:hAnsi="Times New Roman" w:cs="Times New Roman"/>
@@ -1785,7 +1756,6 @@
               </w:rPr>
               <w:t>Simulation_Tests_One_Categorical_Variable</w:t>
             </w:r>
-            <w:proofErr w:type="spellEnd"/>
           </w:p>
           <w:p>
             <w:pPr>
@@ -1796,7 +1766,6 @@
                 <w:sz w:val="24"/>
               </w:rPr>
             </w:pPr>
-            <w:proofErr w:type="spellStart"/>
             <w:r>
               <w:rPr>
                 <w:rFonts w:ascii="Times New Roman" w:eastAsia="Times New Roman" w:hAnsi="Times New Roman" w:cs="Times New Roman"/>
@@ -1805,7 +1774,6 @@
               </w:rPr>
               <w:t>Confidence_Intervals</w:t>
             </w:r>
-            <w:proofErr w:type="spellEnd"/>
           </w:p>
           <w:p>
             <w:pPr>
@@ -1815,7 +1783,6 @@
                 <w:sz w:val="24"/>
               </w:rPr>
             </w:pPr>
-            <w:proofErr w:type="spellStart"/>
             <w:r>
               <w:rPr>
                 <w:rFonts w:ascii="Times New Roman" w:eastAsia="Times New Roman" w:hAnsi="Times New Roman" w:cs="Times New Roman"/>
@@ -1824,7 +1791,6 @@
               </w:rPr>
               <w:t>Bootstrap_Intervals_One_Categorical_Variable</w:t>
             </w:r>
-            <w:proofErr w:type="spellEnd"/>
           </w:p>
           <w:p>
             <w:pPr>
@@ -2677,7 +2643,6 @@
                 <w:sz w:val="24"/>
               </w:rPr>
             </w:pPr>
-            <w:proofErr w:type="spellStart"/>
             <w:r>
               <w:rPr>
                 <w:rFonts w:ascii="Times New Roman" w:eastAsia="Times New Roman" w:hAnsi="Times New Roman" w:cs="Times New Roman"/>
@@ -2686,7 +2651,6 @@
               </w:rPr>
               <w:t>Theory_Based_Inference</w:t>
             </w:r>
-            <w:proofErr w:type="spellEnd"/>
           </w:p>
           <w:p>
             <w:pPr>
@@ -2696,7 +2660,6 @@
                 <w:sz w:val="24"/>
               </w:rPr>
             </w:pPr>
-            <w:proofErr w:type="spellStart"/>
             <w:r>
               <w:rPr>
                 <w:rFonts w:ascii="Times New Roman" w:eastAsia="Times New Roman" w:hAnsi="Times New Roman" w:cs="Times New Roman"/>
@@ -2705,7 +2668,6 @@
               </w:rPr>
               <w:t>Theoretical_Tests_One_Categorical_Variable</w:t>
             </w:r>
-            <w:proofErr w:type="spellEnd"/>
           </w:p>
           <w:p>
             <w:pPr>
@@ -2715,7 +2677,6 @@
                 <w:sz w:val="24"/>
               </w:rPr>
             </w:pPr>
-            <w:proofErr w:type="spellStart"/>
             <w:r>
               <w:rPr>
                 <w:rFonts w:ascii="Times New Roman" w:eastAsia="Times New Roman" w:hAnsi="Times New Roman" w:cs="Times New Roman"/>
@@ -2725,7 +2686,6 @@
               <w:lastRenderedPageBreak/>
               <w:t>Theoretical_Intervals_One_Categorical_Variable</w:t>
             </w:r>
-            <w:proofErr w:type="spellEnd"/>
           </w:p>
           <w:p>
             <w:pPr>
@@ -3959,7 +3919,6 @@
                 <w:sz w:val="24"/>
               </w:rPr>
             </w:pPr>
-            <w:proofErr w:type="spellStart"/>
             <w:r>
               <w:rPr>
                 <w:rFonts w:ascii="Times New Roman" w:hAnsi="Times New Roman" w:cs="Times New Roman"/>
@@ -3968,7 +3927,6 @@
               </w:rPr>
               <w:t>One_Quantitative_Variable_Statistics</w:t>
             </w:r>
-            <w:proofErr w:type="spellEnd"/>
           </w:p>
           <w:p>
             <w:pPr>
@@ -3978,7 +3936,6 @@
                 <w:sz w:val="24"/>
               </w:rPr>
             </w:pPr>
-            <w:proofErr w:type="spellStart"/>
             <w:r>
               <w:rPr>
                 <w:rFonts w:ascii="Times New Roman" w:hAnsi="Times New Roman" w:cs="Times New Roman"/>
@@ -3987,7 +3944,6 @@
               </w:rPr>
               <w:t>One_Quantitative_Variable_Plots</w:t>
             </w:r>
-            <w:proofErr w:type="spellEnd"/>
           </w:p>
           <w:p>
             <w:pPr>
@@ -3997,7 +3953,6 @@
                 <w:sz w:val="24"/>
               </w:rPr>
             </w:pPr>
-            <w:proofErr w:type="spellStart"/>
             <w:r>
               <w:rPr>
                 <w:rFonts w:ascii="Times New Roman" w:hAnsi="Times New Roman" w:cs="Times New Roman"/>
@@ -4006,7 +3961,6 @@
               </w:rPr>
               <w:t>Simulation_Tests_One_Quantitative_Variable</w:t>
             </w:r>
-            <w:proofErr w:type="spellEnd"/>
           </w:p>
           <w:p>
             <w:pPr>
@@ -4017,7 +3971,6 @@
                 <w:sz w:val="24"/>
               </w:rPr>
             </w:pPr>
-            <w:proofErr w:type="spellStart"/>
             <w:r>
               <w:rPr>
                 <w:rFonts w:ascii="Times New Roman" w:hAnsi="Times New Roman" w:cs="Times New Roman"/>
@@ -4026,7 +3979,6 @@
               </w:rPr>
               <w:t>Bootstrap_Intervals_One_Quantitative_Variable</w:t>
             </w:r>
-            <w:proofErr w:type="spellEnd"/>
           </w:p>
           <w:p>
             <w:pPr>
@@ -4431,7 +4383,6 @@
                 <w:szCs w:val="24"/>
               </w:rPr>
             </w:pPr>
-            <w:proofErr w:type="spellStart"/>
             <w:r>
               <w:rPr>
                 <w:rFonts w:ascii="Times New Roman" w:hAnsi="Times New Roman" w:cs="Times New Roman"/>
@@ -4441,7 +4392,6 @@
               </w:rPr>
               <w:t>Theoretical_Tests_One_Quantitative_Variable</w:t>
             </w:r>
-            <w:proofErr w:type="spellEnd"/>
           </w:p>
           <w:p>
             <w:pPr>
@@ -4452,7 +4402,6 @@
                 <w:szCs w:val="24"/>
               </w:rPr>
             </w:pPr>
-            <w:proofErr w:type="spellStart"/>
             <w:r>
               <w:rPr>
                 <w:rFonts w:ascii="Times New Roman" w:hAnsi="Times New Roman" w:cs="Times New Roman"/>
@@ -4462,7 +4411,6 @@
               </w:rPr>
               <w:t>Theoretical_Intervals_One_Quantitative_Variable</w:t>
             </w:r>
-            <w:proofErr w:type="spellEnd"/>
           </w:p>
           <w:p>
             <w:pPr>
@@ -4473,7 +4421,6 @@
                 <w:szCs w:val="24"/>
               </w:rPr>
             </w:pPr>
-            <w:proofErr w:type="spellStart"/>
             <w:r>
               <w:rPr>
                 <w:rFonts w:ascii="Times New Roman" w:hAnsi="Times New Roman" w:cs="Times New Roman"/>
@@ -4483,7 +4430,6 @@
               </w:rPr>
               <w:t>Errors_Power</w:t>
             </w:r>
-            <w:proofErr w:type="spellEnd"/>
           </w:p>
           <w:p>
             <w:pPr>
@@ -5174,7 +5120,6 @@
                 <w:szCs w:val="24"/>
               </w:rPr>
             </w:pPr>
-            <w:proofErr w:type="spellStart"/>
             <w:r>
               <w:rPr>
                 <w:rFonts w:ascii="Times New Roman" w:hAnsi="Times New Roman" w:cs="Times New Roman"/>
@@ -5184,7 +5129,6 @@
               </w:rPr>
               <w:t>Variable_Roles</w:t>
             </w:r>
-            <w:proofErr w:type="spellEnd"/>
           </w:p>
           <w:p>
             <w:pPr>
@@ -5195,7 +5139,6 @@
                 <w:szCs w:val="24"/>
               </w:rPr>
             </w:pPr>
-            <w:proofErr w:type="spellStart"/>
             <w:r>
               <w:rPr>
                 <w:rFonts w:ascii="Times New Roman" w:hAnsi="Times New Roman" w:cs="Times New Roman"/>
@@ -5205,7 +5148,6 @@
               </w:rPr>
               <w:t>Study_Design</w:t>
             </w:r>
-            <w:proofErr w:type="spellEnd"/>
           </w:p>
           <w:p>
             <w:pPr>
@@ -5216,7 +5158,6 @@
                 <w:szCs w:val="24"/>
               </w:rPr>
             </w:pPr>
-            <w:proofErr w:type="spellStart"/>
             <w:r>
               <w:rPr>
                 <w:rFonts w:ascii="Times New Roman" w:hAnsi="Times New Roman" w:cs="Times New Roman"/>
@@ -5226,7 +5167,6 @@
               </w:rPr>
               <w:t>Two_Categorical_Variables_Statistics</w:t>
             </w:r>
-            <w:proofErr w:type="spellEnd"/>
           </w:p>
           <w:p>
             <w:pPr>
@@ -5237,7 +5177,6 @@
                 <w:szCs w:val="24"/>
               </w:rPr>
             </w:pPr>
-            <w:proofErr w:type="spellStart"/>
             <w:r>
               <w:rPr>
                 <w:rFonts w:ascii="Times New Roman" w:hAnsi="Times New Roman" w:cs="Times New Roman"/>
@@ -5247,7 +5186,6 @@
               </w:rPr>
               <w:t>Two_Categorical_Variables_Plots</w:t>
             </w:r>
-            <w:proofErr w:type="spellEnd"/>
           </w:p>
           <w:p>
             <w:pPr>
@@ -5258,7 +5196,6 @@
                 <w:szCs w:val="24"/>
               </w:rPr>
             </w:pPr>
-            <w:proofErr w:type="spellStart"/>
             <w:r>
               <w:rPr>
                 <w:rFonts w:ascii="Times New Roman" w:hAnsi="Times New Roman" w:cs="Times New Roman"/>
@@ -5268,7 +5205,6 @@
               </w:rPr>
               <w:t>Simulation_Tests_Two_Categorical_Variables</w:t>
             </w:r>
-            <w:proofErr w:type="spellEnd"/>
           </w:p>
           <w:p>
             <w:pPr>
@@ -5279,7 +5215,6 @@
                 <w:szCs w:val="24"/>
               </w:rPr>
             </w:pPr>
-            <w:proofErr w:type="spellStart"/>
             <w:r>
               <w:rPr>
                 <w:rFonts w:ascii="Times New Roman" w:hAnsi="Times New Roman" w:cs="Times New Roman"/>
@@ -5290,7 +5225,6 @@
               <w:lastRenderedPageBreak/>
               <w:t>Bootstrap_Intervals_Two_Categorical_Variables</w:t>
             </w:r>
-            <w:proofErr w:type="spellEnd"/>
           </w:p>
           <w:p>
             <w:pPr>
@@ -5301,7 +5235,6 @@
                 <w:szCs w:val="24"/>
               </w:rPr>
             </w:pPr>
-            <w:proofErr w:type="spellStart"/>
             <w:r>
               <w:rPr>
                 <w:rFonts w:ascii="Times New Roman" w:hAnsi="Times New Roman" w:cs="Times New Roman"/>
@@ -5311,7 +5244,6 @@
               </w:rPr>
               <w:t>Relative_Risk</w:t>
             </w:r>
-            <w:proofErr w:type="spellEnd"/>
           </w:p>
           <w:p>
             <w:pPr>
@@ -5969,7 +5901,6 @@
                 <w:sz w:val="24"/>
               </w:rPr>
             </w:pPr>
-            <w:proofErr w:type="spellStart"/>
             <w:r>
               <w:rPr>
                 <w:rFonts w:ascii="Times New Roman" w:hAnsi="Times New Roman" w:cs="Times New Roman"/>
@@ -5978,7 +5909,6 @@
               </w:rPr>
               <w:t>Theoretical_Tests_Two_Categorical_Variables</w:t>
             </w:r>
-            <w:proofErr w:type="spellEnd"/>
           </w:p>
           <w:p>
             <w:pPr>
@@ -5988,7 +5918,6 @@
                 <w:sz w:val="24"/>
               </w:rPr>
             </w:pPr>
-            <w:proofErr w:type="spellStart"/>
             <w:r>
               <w:rPr>
                 <w:rFonts w:ascii="Times New Roman" w:hAnsi="Times New Roman" w:cs="Times New Roman"/>
@@ -5997,7 +5926,6 @@
               </w:rPr>
               <w:t>Theoretical_Intervals_Two_Categorical_Variables</w:t>
             </w:r>
-            <w:proofErr w:type="spellEnd"/>
           </w:p>
           <w:p>
             <w:pPr>
@@ -7119,7 +7047,6 @@
                 <w:szCs w:val="20"/>
               </w:rPr>
             </w:pPr>
-            <w:proofErr w:type="spellStart"/>
             <w:r>
               <w:rPr>
                 <w:rFonts w:ascii="Times New Roman" w:hAnsi="Times New Roman" w:cs="Times New Roman"/>
@@ -7128,7 +7055,6 @@
               </w:rPr>
               <w:t>Quantitative_Response_Independent_Groups_EDA</w:t>
             </w:r>
-            <w:proofErr w:type="spellEnd"/>
           </w:p>
           <w:p>
             <w:pPr>
@@ -7138,7 +7064,6 @@
                 <w:szCs w:val="20"/>
               </w:rPr>
             </w:pPr>
-            <w:proofErr w:type="spellStart"/>
             <w:r>
               <w:rPr>
                 <w:rFonts w:ascii="Times New Roman" w:hAnsi="Times New Roman" w:cs="Times New Roman"/>
@@ -7147,7 +7072,6 @@
               </w:rPr>
               <w:t>Simulation_Tests_Quantitative_Response_Independent_Groups</w:t>
             </w:r>
-            <w:proofErr w:type="spellEnd"/>
           </w:p>
           <w:p>
             <w:pPr>
@@ -7157,7 +7081,6 @@
                 <w:szCs w:val="20"/>
               </w:rPr>
             </w:pPr>
-            <w:proofErr w:type="spellStart"/>
             <w:r>
               <w:rPr>
                 <w:rFonts w:ascii="Times New Roman" w:hAnsi="Times New Roman" w:cs="Times New Roman"/>
@@ -7166,7 +7089,6 @@
               </w:rPr>
               <w:t>Bootstrap_Intervals_Quantitative_Response_Independent_Groups</w:t>
             </w:r>
-            <w:proofErr w:type="spellEnd"/>
           </w:p>
           <w:p>
             <w:pPr>
@@ -7176,7 +7098,6 @@
                 <w:szCs w:val="20"/>
               </w:rPr>
             </w:pPr>
-            <w:proofErr w:type="spellStart"/>
             <w:r>
               <w:rPr>
                 <w:rFonts w:ascii="Times New Roman" w:hAnsi="Times New Roman" w:cs="Times New Roman"/>
@@ -7185,7 +7106,6 @@
               </w:rPr>
               <w:t>Theoretical_Tests_Quantitative_Response_Independent_Groups</w:t>
             </w:r>
-            <w:proofErr w:type="spellEnd"/>
           </w:p>
           <w:p>
             <w:pPr>
@@ -7196,7 +7116,6 @@
                 <w:szCs w:val="20"/>
               </w:rPr>
             </w:pPr>
-            <w:proofErr w:type="spellStart"/>
             <w:r>
               <w:rPr>
                 <w:rFonts w:ascii="Times New Roman" w:hAnsi="Times New Roman" w:cs="Times New Roman"/>
@@ -7205,7 +7124,6 @@
               </w:rPr>
               <w:t>Theoretical_Intervals_Quantitative_Response_Independent_Groups</w:t>
             </w:r>
-            <w:proofErr w:type="spellEnd"/>
           </w:p>
           <w:p>
             <w:pPr>
@@ -7848,7 +7766,6 @@
                 <w:sz w:val="24"/>
               </w:rPr>
             </w:pPr>
-            <w:proofErr w:type="spellStart"/>
             <w:r>
               <w:rPr>
                 <w:rFonts w:ascii="Times New Roman" w:hAnsi="Times New Roman" w:cs="Times New Roman"/>
@@ -7857,7 +7774,6 @@
               </w:rPr>
               <w:t>Paired_Data</w:t>
             </w:r>
-            <w:proofErr w:type="spellEnd"/>
           </w:p>
           <w:p>
             <w:pPr>
@@ -7867,7 +7783,6 @@
                 <w:sz w:val="24"/>
               </w:rPr>
             </w:pPr>
-            <w:proofErr w:type="spellStart"/>
             <w:r>
               <w:rPr>
                 <w:rFonts w:ascii="Times New Roman" w:hAnsi="Times New Roman" w:cs="Times New Roman"/>
@@ -7876,7 +7791,6 @@
               </w:rPr>
               <w:t>Simulation_Inference_Paired_Data</w:t>
             </w:r>
-            <w:proofErr w:type="spellEnd"/>
           </w:p>
           <w:p>
             <w:pPr>
@@ -7886,7 +7800,6 @@
                 <w:sz w:val="24"/>
               </w:rPr>
             </w:pPr>
-            <w:proofErr w:type="spellStart"/>
             <w:r>
               <w:rPr>
                 <w:rFonts w:ascii="Times New Roman" w:hAnsi="Times New Roman" w:cs="Times New Roman"/>
@@ -7895,7 +7808,6 @@
               </w:rPr>
               <w:t>Theoretical_Inference_Paired_Data</w:t>
             </w:r>
-            <w:proofErr w:type="spellEnd"/>
           </w:p>
           <w:p>
             <w:pPr>
@@ -8666,7 +8578,6 @@
                 <w:sz w:val="24"/>
               </w:rPr>
             </w:pPr>
-            <w:proofErr w:type="spellStart"/>
             <w:r>
               <w:rPr>
                 <w:rFonts w:ascii="Times New Roman" w:hAnsi="Times New Roman" w:cs="Times New Roman"/>
@@ -8675,7 +8586,6 @@
               </w:rPr>
               <w:t>Two_Quantitative_Variables_Plots</w:t>
             </w:r>
-            <w:proofErr w:type="spellEnd"/>
           </w:p>
           <w:p>
             <w:pPr>
@@ -8685,7 +8595,6 @@
                 <w:sz w:val="24"/>
               </w:rPr>
             </w:pPr>
-            <w:proofErr w:type="spellStart"/>
             <w:r>
               <w:rPr>
                 <w:rFonts w:ascii="Times New Roman" w:hAnsi="Times New Roman" w:cs="Times New Roman"/>
@@ -8694,7 +8603,6 @@
               </w:rPr>
               <w:t>Two_Quantitative_Variables_Linear_Regression</w:t>
             </w:r>
-            <w:proofErr w:type="spellEnd"/>
           </w:p>
           <w:p>
             <w:pPr>
@@ -8704,7 +8612,6 @@
                 <w:sz w:val="24"/>
               </w:rPr>
             </w:pPr>
-            <w:proofErr w:type="spellStart"/>
             <w:r>
               <w:rPr>
                 <w:rFonts w:ascii="Times New Roman" w:hAnsi="Times New Roman" w:cs="Times New Roman"/>
@@ -8713,7 +8620,6 @@
               </w:rPr>
               <w:t>Two_Quantitative_Variables_Statistics</w:t>
             </w:r>
-            <w:proofErr w:type="spellEnd"/>
           </w:p>
           <w:p>
             <w:pPr>
@@ -8723,7 +8629,6 @@
                 <w:sz w:val="24"/>
               </w:rPr>
             </w:pPr>
-            <w:proofErr w:type="spellStart"/>
             <w:r>
               <w:rPr>
                 <w:rFonts w:ascii="Times New Roman" w:hAnsi="Times New Roman" w:cs="Times New Roman"/>
@@ -8732,7 +8637,6 @@
               </w:rPr>
               <w:t>Multivariate_Plots</w:t>
             </w:r>
-            <w:proofErr w:type="spellEnd"/>
           </w:p>
           <w:p>
             <w:pPr>
@@ -8742,7 +8646,6 @@
                 <w:sz w:val="24"/>
               </w:rPr>
             </w:pPr>
-            <w:proofErr w:type="spellStart"/>
             <w:r>
               <w:rPr>
                 <w:rFonts w:ascii="Times New Roman" w:hAnsi="Times New Roman" w:cs="Times New Roman"/>
@@ -8751,7 +8654,6 @@
               </w:rPr>
               <w:t>Simulation_Inference_Two_Quantitative_Variables</w:t>
             </w:r>
-            <w:proofErr w:type="spellEnd"/>
           </w:p>
           <w:p>
             <w:pPr>
@@ -8761,7 +8663,6 @@
                 <w:sz w:val="24"/>
               </w:rPr>
             </w:pPr>
-            <w:proofErr w:type="spellStart"/>
             <w:r>
               <w:rPr>
                 <w:rFonts w:ascii="Times New Roman" w:hAnsi="Times New Roman" w:cs="Times New Roman"/>
@@ -8770,7 +8671,6 @@
               </w:rPr>
               <w:t>Theoretical_Inference_Two_Quantitative_Variables</w:t>
             </w:r>
-            <w:proofErr w:type="spellEnd"/>
           </w:p>
           <w:p>
             <w:pPr>
@@ -10129,6 +10029,14 @@
                 <w:szCs w:val="24"/>
               </w:rPr>
             </w:pPr>
+            <w:r>
+              <w:rPr>
+                <w:rFonts w:ascii="Times New Roman" w:hAnsi="Times New Roman" w:cs="Times New Roman"/>
+                <w:sz w:val="24"/>
+                <w:szCs w:val="24"/>
+              </w:rPr>
+              <w:t>Thurs 12/17</w:t>
+            </w:r>
           </w:p>
         </w:tc>
         <w:tc>
@@ -10170,7 +10078,38 @@
                 <w:szCs w:val="24"/>
                 <w:highlight w:val="yellow"/>
               </w:rPr>
-              <w:t>TBA</w:t>
+              <w:t>T</w:t>
+            </w:r>
+            <w:r>
+              <w:rPr>
+                <w:rFonts w:ascii="Times New Roman" w:eastAsia="Times New Roman" w:hAnsi="Times New Roman" w:cs="Times New Roman"/>
+                <w:b/>
+                <w:sz w:val="24"/>
+                <w:szCs w:val="24"/>
+                <w:highlight w:val="yellow"/>
+              </w:rPr>
+              <w:t>hursday, December 17</w:t>
+            </w:r>
+            <w:r>
+              <w:rPr>
+                <w:rFonts w:ascii="Times New Roman" w:eastAsia="Times New Roman" w:hAnsi="Times New Roman" w:cs="Times New Roman"/>
+                <w:b/>
+                <w:sz w:val="24"/>
+                <w:szCs w:val="24"/>
+                <w:highlight w:val="yellow"/>
+                <w:vertAlign w:val="superscript"/>
+              </w:rPr>
+              <w:t>th</w:t>
+            </w:r>
+            <w:r>
+              <w:rPr>
+                <w:rFonts w:ascii="Times New Roman" w:eastAsia="Times New Roman" w:hAnsi="Times New Roman" w:cs="Times New Roman"/>
+                <w:b/>
+                <w:sz w:val="24"/>
+                <w:szCs w:val="24"/>
+                <w:highlight w:val="yellow"/>
+              </w:rPr>
+              <w:t xml:space="preserve"> from 6 – 7:50 pm</w:t>
             </w:r>
           </w:p>
         </w:tc>
@@ -10246,7 +10185,7 @@
 </file>
 
 <file path=word/numbering.xml><?xml version="1.0" encoding="utf-8"?>
-<w:numbering xmlns:wpc="http://schemas.microsoft.com/office/word/2010/wordprocessingCanvas" xmlns:cx="http://schemas.microsoft.com/office/drawing/2014/chartex" xmlns:cx1="http://schemas.microsoft.com/office/drawing/2015/9/8/chartex" xmlns:cx2="http://schemas.microsoft.com/office/drawing/2015/10/21/chartex" xmlns:cx3="http://schemas.microsoft.com/office/drawing/2016/5/9/chartex" xmlns:cx4="http://schemas.microsoft.com/office/drawing/2016/5/10/chartex" xmlns:cx5="http://schemas.microsoft.com/office/drawing/2016/5/11/chartex" xmlns:cx6="http://schemas.microsoft.com/office/drawing/2016/5/12/chartex" xmlns:cx7="http://schemas.microsoft.com/office/drawing/2016/5/13/chartex" xmlns:cx8="http://schemas.microsoft.com/office/drawing/2016/5/14/chartex" xmlns:mc="http://schemas.openxmlformats.org/markup-compatibility/2006" xmlns:aink="http://schemas.microsoft.com/office/drawing/2016/ink" xmlns:am3d="http://schemas.microsoft.com/office/drawing/2017/model3d" xmlns:o="urn:schemas-microsoft-com:office:office" xmlns:oel="http://schemas.microsoft.com/office/2019/extlst" xmlns:r="http://schemas.openxmlformats.org/officeDocument/2006/relationships" xmlns:m="http://schemas.openxmlformats.org/officeDocument/2006/math" xmlns:v="urn:schemas-microsoft-com:vml" xmlns:wp14="http://schemas.microsoft.com/office/word/2010/wordprocessingDrawing" xmlns:wp="http://schemas.openxmlformats.org/drawingml/2006/wordprocessingDrawing" xmlns:w10="urn:schemas-microsoft-com:office:word" xmlns:w="http://schemas.openxmlformats.org/wordprocessingml/2006/main" xmlns:w14="http://schemas.microsoft.com/office/word/2010/wordml" xmlns:w15="http://schemas.microsoft.com/office/word/2012/wordml" xmlns:w16cei="http://schemas.microsoft.com/office/word/2026/wordml/cei" xmlns:w16cex="http://schemas.microsoft.com/office/word/2018/wordml/cex" xmlns:w16cid="http://schemas.microsoft.com/office/word/2016/wordml/cid" xmlns:w16="http://schemas.microsoft.com/office/word/2018/wordml" xmlns:w16du="http://schemas.microsoft.com/office/word/2023/wordml/word16du" xmlns:w16sdtdh="http://schemas.microsoft.com/office/word/2020/wordml/sdtdatahash" xmlns:w16sdtfl="http://schemas.microsoft.com/office/word/2024/wordml/sdtformatlock" xmlns:w16se="http://schemas.microsoft.com/office/word/2015/wordml/symex" xmlns:wpg="http://schemas.microsoft.com/office/word/2010/wordprocessingGroup" xmlns:wpi="http://schemas.microsoft.com/office/word/2010/wordprocessingInk" xmlns:wne="http://schemas.microsoft.com/office/word/2006/wordml" xmlns:wps="http://schemas.microsoft.com/office/word/2010/wordprocessingShape" mc:Ignorable="w14 w15 w16se w16cid w16 w16cex w16sdtdh w16sdtfl w16du wp14">
+<w:numbering xmlns:wpc="http://schemas.microsoft.com/office/word/2010/wordprocessingCanvas" xmlns:cx="http://schemas.microsoft.com/office/drawing/2014/chartex" xmlns:cx1="http://schemas.microsoft.com/office/drawing/2015/9/8/chartex" xmlns:cx2="http://schemas.microsoft.com/office/drawing/2015/10/21/chartex" xmlns:cx3="http://schemas.microsoft.com/office/drawing/2016/5/9/chartex" xmlns:cx4="http://schemas.microsoft.com/office/drawing/2016/5/10/chartex" xmlns:cx5="http://schemas.microsoft.com/office/drawing/2016/5/11/chartex" xmlns:cx6="http://schemas.microsoft.com/office/drawing/2016/5/12/chartex" xmlns:cx7="http://schemas.microsoft.com/office/drawing/2016/5/13/chartex" xmlns:cx8="http://schemas.microsoft.com/office/drawing/2016/5/14/chartex" xmlns:mc="http://schemas.openxmlformats.org/markup-compatibility/2006" xmlns:aink="http://schemas.microsoft.com/office/drawing/2016/ink" xmlns:am3d="http://schemas.microsoft.com/office/drawing/2017/model3d" xmlns:o="urn:schemas-microsoft-com:office:office" xmlns:oel="http://schemas.microsoft.com/office/2019/extlst" xmlns:r="http://schemas.openxmlformats.org/officeDocument/2006/relationships" xmlns:m="http://schemas.openxmlformats.org/officeDocument/2006/math" xmlns:v="urn:schemas-microsoft-com:vml" xmlns:wp14="http://schemas.microsoft.com/office/word/2010/wordprocessingDrawing" xmlns:wp="http://schemas.openxmlformats.org/drawingml/2006/wordprocessingDrawing" xmlns:w10="urn:schemas-microsoft-com:office:word" xmlns:w="http://schemas.openxmlformats.org/wordprocessingml/2006/main" xmlns:w14="http://schemas.microsoft.com/office/word/2010/wordml" xmlns:w15="http://schemas.microsoft.com/office/word/2012/wordml" xmlns:w16cex="http://schemas.microsoft.com/office/word/2018/wordml/cex" xmlns:w16cid="http://schemas.microsoft.com/office/word/2016/wordml/cid" xmlns:w16="http://schemas.microsoft.com/office/word/2018/wordml" xmlns:w16du="http://schemas.microsoft.com/office/word/2023/wordml/word16du" xmlns:w16sdtdh="http://schemas.microsoft.com/office/word/2020/wordml/sdtdatahash" xmlns:w16sdtfl="http://schemas.microsoft.com/office/word/2024/wordml/sdtformatlock" xmlns:w16se="http://schemas.microsoft.com/office/word/2015/wordml/symex" xmlns:wpg="http://schemas.microsoft.com/office/word/2010/wordprocessingGroup" xmlns:wpi="http://schemas.microsoft.com/office/word/2010/wordprocessingInk" xmlns:wne="http://schemas.microsoft.com/office/word/2006/wordml" xmlns:wps="http://schemas.microsoft.com/office/word/2010/wordprocessingShape" mc:Ignorable="w14 w15 w16se w16cid w16 w16cex w16sdtdh w16sdtfl w16du wp14">
   <w:abstractNum w:abstractNumId="0" w15:restartNumberingAfterBreak="0">
     <w:nsid w:val="120865F2"/>
     <w:multiLevelType w:val="hybridMultilevel"/>
@@ -13633,9 +13572,12 @@
 </file>
 
 <file path=customXml/item1.xml><?xml version="1.0" encoding="utf-8"?>
-<p:properties xmlns:p="http://schemas.microsoft.com/office/2006/metadata/properties" xmlns:xsi="http://www.w3.org/2001/XMLSchema-instance" xmlns:pc="http://schemas.microsoft.com/office/infopath/2007/PartnerControls">
-  <documentManagement/>
-</p:properties>
+<?mso-contentType ?>
+<FormTemplates xmlns="http://schemas.microsoft.com/sharepoint/v3/contenttype/forms">
+  <Display>DocumentLibraryForm</Display>
+  <Edit>DocumentLibraryForm</Edit>
+  <New>DocumentLibraryForm</New>
+</FormTemplates>
 </file>
 
 <file path=customXml/item2.xml><?xml version="1.0" encoding="utf-8"?>
@@ -13771,19 +13713,15 @@
 </file>
 
 <file path=customXml/item3.xml><?xml version="1.0" encoding="utf-8"?>
-<?mso-contentType ?>
-<FormTemplates xmlns="http://schemas.microsoft.com/sharepoint/v3/contenttype/forms">
-  <Display>DocumentLibraryForm</Display>
-  <Edit>DocumentLibraryForm</Edit>
-  <New>DocumentLibraryForm</New>
-</FormTemplates>
+<p:properties xmlns:p="http://schemas.microsoft.com/office/2006/metadata/properties" xmlns:xsi="http://www.w3.org/2001/XMLSchema-instance" xmlns:pc="http://schemas.microsoft.com/office/infopath/2007/PartnerControls">
+  <documentManagement/>
+</p:properties>
 </file>
 
 <file path=customXml/itemProps1.xml><?xml version="1.0" encoding="utf-8"?>
-<ds:datastoreItem xmlns:ds="http://schemas.openxmlformats.org/officeDocument/2006/customXml" ds:itemID="{36ACC8F3-6E63-4670-B73D-DE1280E8DB8D}">
+<ds:datastoreItem xmlns:ds="http://schemas.openxmlformats.org/officeDocument/2006/customXml" ds:itemID="{73898C2B-C96D-434F-A1B6-6069F656FA6D}">
   <ds:schemaRefs>
-    <ds:schemaRef ds:uri="http://schemas.microsoft.com/office/2006/metadata/properties"/>
-    <ds:schemaRef ds:uri="http://schemas.microsoft.com/office/infopath/2007/PartnerControls"/>
+    <ds:schemaRef ds:uri="http://schemas.microsoft.com/sharepoint/v3/contenttype/forms"/>
   </ds:schemaRefs>
 </ds:datastoreItem>
 </file>
@@ -13807,9 +13745,10 @@
 </file>
 
 <file path=customXml/itemProps3.xml><?xml version="1.0" encoding="utf-8"?>
-<ds:datastoreItem xmlns:ds="http://schemas.openxmlformats.org/officeDocument/2006/customXml" ds:itemID="{73898C2B-C96D-434F-A1B6-6069F656FA6D}">
+<ds:datastoreItem xmlns:ds="http://schemas.openxmlformats.org/officeDocument/2006/customXml" ds:itemID="{36ACC8F3-6E63-4670-B73D-DE1280E8DB8D}">
   <ds:schemaRefs>
-    <ds:schemaRef ds:uri="http://schemas.microsoft.com/sharepoint/v3/contenttype/forms"/>
+    <ds:schemaRef ds:uri="http://schemas.microsoft.com/office/2006/metadata/properties"/>
+    <ds:schemaRef ds:uri="http://schemas.microsoft.com/office/infopath/2007/PartnerControls"/>
   </ds:schemaRefs>
 </ds:datastoreItem>
 </file>
</xml_diff>